<commit_message>
statja: update article with corpus stats, self-citation, green highlights
- Update corpus to 1,193 files (new meta-analysis results)
- Fill §6.3 [TODO]: direct-only 2.22× vs merged 2.25×
- Add −1 shift column to Table 2; update all frequencies from new reports
- Add self-citation [REF-BOOK] and counter metaphor in §6.1
- Add REF-BOOK/REF-ART1/REF-ART2 stubs to References
- md_to_docx: support ==text== → green text color for recent edits
- Add todo.txt with article improvement checklist
</commit_message>
<xml_diff>
--- a/statja/article.docx
+++ b/statja/article.docx
@@ -39,7 +39,7 @@
         <w:t>count</w:t>
       </w:r>
       <w:r>
-        <w:t xml:space="preserve"> of structural element repetitions within a piece. Analysing a corpus of 1,024 Bach and Baroque works, we find that motif occurrence counts are smooth numbers significantly more often than expected under a log-uniform null model (enrichment ratio 2.25×). A shift test confirms the result is not an artefact of frequency-table shape: real counts are 1.47× denser at smooth positions than counts shifted by +1 (threshold ≥ 16), rising to 2.28× at threshold ≥ 48. Three illustrative cases from Bach — WTC Prelude No. 7 in E♭ major (192 = 2^6·3 occurrences of a stepwise sixteenth-note figure, direct and inverted forms combined), WTC Fugue No. 12 in F minor (96 = 2^5·3 occurrences of a sixteenth-note countersubject figure), and the BWV 944 Fugue in A minor (128 = 2^7 occurrences of a characteristic three-note motive) — show the pattern at its clearest. The effect is robustly present across other Baroque composers (Corelli 1.89×, Scarlatti 1.99×, Buxtehude 1.66×, Frescobaldi 1.70×) and persists, somewhat attenuated, into the Classical period (Haydn 1.77×, Mozart 1.90×, Beethoven 1.72×). The mechanism behind this alignment remains an open question.</w:t>
+        <w:t xml:space="preserve"> of structural element repetitions within a piece. Analysing a corpus of 1,193 Bach and Baroque works, we find that motif occurrence counts are smooth numbers significantly more often than expected under a log-uniform null model (enrichment ratio 2.25×). A shift test confirms the result is not an artefact of frequency-table shape: real counts are 1.41× denser at smooth positions than counts shifted by +1 (threshold ≥ 16), rising to 2.09× at threshold ≥ 36. Three illustrative cases from Bach — WTC Prelude No. 7 in E♭ major (192 = 2^6·3 occurrences of a stepwise sixteenth-note figure, direct and inverted forms combined), WTC Fugue No. 12 in F minor (96 = 2^5·3 occurrences of a sixteenth-note countersubject figure), and the BWV 944 Fugue in A minor (128 = 2^7 occurrences of a characteristic three-note motive) — show the pattern at its clearest. The effect is robustly present across other Baroque composers (Corelli 1.89×, Scarlatti 1.99×, Buxtehude 1.66×, Frescobaldi 1.70×) and persists, somewhat attenuated, into the Classical period (Haydn 1.77×, Mozart 1.90×, Beethoven 1.72×). The mechanism behind this alignment remains an open question.</w:t>
       </w:r>
     </w:p>
     <w:p>
@@ -210,6 +210,15 @@
     <w:p>
       <w:pPr/>
       <w:r>
+        <w:rPr>
+          <w:color w:val="008C00"/>
+        </w:rPr>
+        <w:t>The hypothesis that smooth-number structure operates beyond bar lengths — extending to the counts of various types of musical events within a piece — was previously formulated and tested manually by the present author [REF-BOOK]. That study examined several categories of "metric points" (equidistant rhythmic group counts, harmonic function counts per section, melodic contour-step counts, and formal proportions) across selected Bach keyboard and orchestral suites and found smooth-number outcomes across all four domains. The present study provides the first large-scale corpus validation of the same hypothesis, applied specifically to melodic interval-sequence motif occurrence counts across a corpus of 1,024 pieces.</w:t>
+      </w:r>
+    </w:p>
+    <w:p>
+      <w:pPr/>
+      <w:r>
         <w:t xml:space="preserve">The present study asks whether the same arithmetic governs one further level: the </w:t>
       </w:r>
       <w:r>
@@ -287,7 +296,7 @@
     <w:p>
       <w:pPr/>
       <w:r>
-        <w:t xml:space="preserve">The corpus consists of 1,024 works analysed successfully from a collection of 1,034 files in two formats: Humdrum </w:t>
+        <w:t xml:space="preserve">The corpus consists of 1,193 works analysed successfully in two formats: Humdrum </w:t>
       </w:r>
       <w:r>
         <w:rPr>
@@ -311,7 +320,7 @@
     <w:p>
       <w:pPr/>
       <w:r>
-        <w:t>10 files failed to parse (&lt; 1%) and were excluded.</w:t>
+        <w:t>All files were analysed successfully (0 parse errors).</w:t>
       </w:r>
     </w:p>
     <w:p>
@@ -729,39 +738,54 @@
         <w:pStyle w:val="Heading3"/>
       </w:pPr>
       <w:r>
-        <w:t>5.1 Bach (full corpus, 1,024 files)</w:t>
+        <w:t>5.1 Bach (full corpus, 1,193 files)</w:t>
       </w:r>
     </w:p>
     <w:p>
       <w:pPr/>
       <w:r>
+        <w:rPr>
+          <w:color w:val="008C00"/>
+        </w:rPr>
         <w:t xml:space="preserve">The total number of retained motif-occurrence counts with k ≥ 8 is </w:t>
       </w:r>
       <w:r>
         <w:rPr>
           <w:b/>
+          <w:color w:val="008C00"/>
         </w:rPr>
-        <w:t>11,340</w:t>
+        <w:t>13,546</w:t>
       </w:r>
       <w:r>
+        <w:rPr>
+          <w:color w:val="008C00"/>
+        </w:rPr>
         <w:t xml:space="preserve">. The smooth-number subset accounts for </w:t>
       </w:r>
       <w:r>
         <w:rPr>
           <w:b/>
+          <w:color w:val="008C00"/>
         </w:rPr>
-        <w:t>4,669</w:t>
+        <w:t>5,566</w:t>
       </w:r>
       <w:r>
-        <w:t xml:space="preserve"> of these. Under the log-uniform null model, the expected smooth count is approximately 2,075, giving an enrichment ratio of </w:t>
+        <w:rPr>
+          <w:color w:val="008C00"/>
+        </w:rPr>
+        <w:t xml:space="preserve"> of these. Under the log-uniform null model, the expected smooth count is approximately 2,479, giving an enrichment ratio of </w:t>
       </w:r>
       <w:r>
         <w:rPr>
           <w:b/>
+          <w:color w:val="008C00"/>
         </w:rPr>
         <w:t>2.25×</w:t>
       </w:r>
       <w:r>
+        <w:rPr>
+          <w:color w:val="008C00"/>
+        </w:rPr>
         <w:t>. Table 1 shows the frequency of occurrence counts at selected smooth values.</w:t>
       </w:r>
     </w:p>
@@ -774,7 +798,7 @@
         <w:t>Table 1.</w:t>
       </w:r>
       <w:r>
-        <w:t xml:space="preserve"> Frequency of smooth occurrence counts in the Bach corpus (k ≥ 8, top 20 by frequency).</w:t>
+        <w:t xml:space="preserve"> Frequency of smooth occurrence counts in the Bach corpus (k ≥ 8).</w:t>
       </w:r>
     </w:p>
     <w:tbl>
@@ -874,7 +898,7 @@
           <w:p>
             <w:r/>
             <w:r>
-              <w:t>1485</w:t>
+              <w:t>1780</w:t>
             </w:r>
           </w:p>
         </w:tc>
@@ -909,7 +933,7 @@
           <w:p>
             <w:r/>
             <w:r>
-              <w:t>1172</w:t>
+              <w:t>1378</w:t>
             </w:r>
           </w:p>
         </w:tc>
@@ -944,7 +968,7 @@
           <w:p>
             <w:r/>
             <w:r>
-              <w:t>722</w:t>
+              <w:t>893</w:t>
             </w:r>
           </w:p>
         </w:tc>
@@ -979,7 +1003,7 @@
           <w:p>
             <w:r/>
             <w:r>
-              <w:t>388</w:t>
+              <w:t>444</w:t>
             </w:r>
           </w:p>
         </w:tc>
@@ -1014,7 +1038,7 @@
           <w:p>
             <w:r/>
             <w:r>
-              <w:t>320</w:t>
+              <w:t>391</w:t>
             </w:r>
           </w:p>
         </w:tc>
@@ -1049,7 +1073,7 @@
           <w:p>
             <w:r/>
             <w:r>
-              <w:t>186</w:t>
+              <w:t>211</w:t>
             </w:r>
           </w:p>
         </w:tc>
@@ -1084,7 +1108,7 @@
           <w:p>
             <w:r/>
             <w:r>
-              <w:t>120</w:t>
+              <w:t>138</w:t>
             </w:r>
           </w:p>
         </w:tc>
@@ -1119,7 +1143,7 @@
           <w:p>
             <w:r/>
             <w:r>
-              <w:t>109</w:t>
+              <w:t>130</w:t>
             </w:r>
           </w:p>
         </w:tc>
@@ -1154,7 +1178,7 @@
           <w:p>
             <w:r/>
             <w:r>
-              <w:t>60</w:t>
+              <w:t>75</w:t>
             </w:r>
           </w:p>
         </w:tc>
@@ -1189,7 +1213,7 @@
           <w:p>
             <w:r/>
             <w:r>
-              <w:t>34</w:t>
+              <w:t>43</w:t>
             </w:r>
           </w:p>
         </w:tc>
@@ -1224,7 +1248,7 @@
           <w:p>
             <w:r/>
             <w:r>
-              <w:t>30</w:t>
+              <w:t>32</w:t>
             </w:r>
           </w:p>
         </w:tc>
@@ -1259,7 +1283,7 @@
           <w:p>
             <w:r/>
             <w:r>
-              <w:t>19</w:t>
+              <w:t>21</w:t>
             </w:r>
           </w:p>
         </w:tc>
@@ -1294,7 +1318,7 @@
           <w:p>
             <w:r/>
             <w:r>
-              <w:t>8</w:t>
+              <w:t>9</w:t>
             </w:r>
           </w:p>
         </w:tc>
@@ -1364,7 +1388,7 @@
           <w:p>
             <w:r/>
             <w:r>
-              <w:t>3</w:t>
+              <w:t>6</w:t>
             </w:r>
           </w:p>
         </w:tc>
@@ -1434,6 +1458,41 @@
           <w:p>
             <w:r/>
             <w:r>
+              <w:t>3</w:t>
+            </w:r>
+          </w:p>
+        </w:tc>
+      </w:tr>
+      <w:tr>
+        <w:tc>
+          <w:tcPr>
+            <w:tcW w:type="dxa" w:w="3041"/>
+          </w:tcPr>
+          <w:p>
+            <w:r/>
+            <w:r>
+              <w:t>144</w:t>
+            </w:r>
+          </w:p>
+        </w:tc>
+        <w:tc>
+          <w:tcPr>
+            <w:tcW w:type="dxa" w:w="3041"/>
+          </w:tcPr>
+          <w:p>
+            <w:r/>
+            <w:r>
+              <w:t>2^4·3^2</w:t>
+            </w:r>
+          </w:p>
+        </w:tc>
+        <w:tc>
+          <w:tcPr>
+            <w:tcW w:type="dxa" w:w="3041"/>
+          </w:tcPr>
+          <w:p>
+            <w:r/>
+            <w:r>
               <w:t>2</w:t>
             </w:r>
           </w:p>
@@ -1479,13 +1538,19 @@
     <w:p>
       <w:pPr/>
       <w:r>
-        <w:t>For comparison, the immediately adjacent non-smooth count 10 appears 954 times and count 11 appears 783 times; count 17 appears 341 times against 16's 388 and 18's 320. The local peaks at smooth positions are visible in the frequency distribution.</w:t>
+        <w:rPr>
+          <w:color w:val="008C00"/>
+        </w:rPr>
+        <w:t>For comparison, the immediately adjacent non-smooth count 10 appears 1,180 times and count 11 appears 915 times; count 17 appears 432 times against 16's 444 and 18's 391. The local peaks at smooth positions are visible in the frequency distribution.</w:t>
       </w:r>
     </w:p>
     <w:p>
       <w:pPr/>
       <w:r>
-        <w:t>The shift test strengthens the conclusion. Table 2 shows the smooth density of real counts versus counts shifted by +1, at several thresholds.</w:t>
+        <w:rPr>
+          <w:color w:val="008C00"/>
+        </w:rPr>
+        <w:t>The shift test strengthens the conclusion. Table 2 shows the smooth density of real counts versus counts shifted by ±1, at several thresholds.</w:t>
       </w:r>
     </w:p>
     <w:p>
@@ -1497,7 +1562,7 @@
         <w:t>Table 2.</w:t>
       </w:r>
       <w:r>
-        <w:t xml:space="preserve"> Shift test results (Bach corpus, shift +1).</w:t>
+        <w:t xml:space="preserve"> Shift test results (Bach corpus, shifts +1 and −1).</w:t>
       </w:r>
     </w:p>
     <w:tbl>
@@ -1507,16 +1572,18 @@
         <w:tblLook w:firstColumn="1" w:firstRow="1" w:lastColumn="0" w:lastRow="0" w:noHBand="0" w:noVBand="1" w:val="04A0"/>
       </w:tblPr>
       <w:tblGrid>
-        <w:gridCol w:w="1824"/>
-        <w:gridCol w:w="1824"/>
-        <w:gridCol w:w="1824"/>
-        <w:gridCol w:w="1824"/>
-        <w:gridCol w:w="1824"/>
+        <w:gridCol w:w="1303"/>
+        <w:gridCol w:w="1303"/>
+        <w:gridCol w:w="1303"/>
+        <w:gridCol w:w="1303"/>
+        <w:gridCol w:w="1303"/>
+        <w:gridCol w:w="1303"/>
+        <w:gridCol w:w="1303"/>
       </w:tblGrid>
       <w:tr>
         <w:tc>
           <w:tcPr>
-            <w:tcW w:type="dxa" w:w="1824"/>
+            <w:tcW w:type="dxa" w:w="1303"/>
           </w:tcPr>
           <w:p>
             <w:r>
@@ -1534,7 +1601,7 @@
         </w:tc>
         <w:tc>
           <w:tcPr>
-            <w:tcW w:type="dxa" w:w="1824"/>
+            <w:tcW w:type="dxa" w:w="1303"/>
           </w:tcPr>
           <w:p>
             <w:r>
@@ -1552,7 +1619,7 @@
         </w:tc>
         <w:tc>
           <w:tcPr>
-            <w:tcW w:type="dxa" w:w="1824"/>
+            <w:tcW w:type="dxa" w:w="1303"/>
           </w:tcPr>
           <w:p>
             <w:r>
@@ -1564,13 +1631,13 @@
               <w:rPr>
                 <w:b/>
               </w:rPr>
-              <w:t>Smooth density (real)</w:t>
+              <w:t>Density (real)</w:t>
             </w:r>
           </w:p>
         </w:tc>
         <w:tc>
           <w:tcPr>
-            <w:tcW w:type="dxa" w:w="1824"/>
+            <w:tcW w:type="dxa" w:w="1303"/>
           </w:tcPr>
           <w:p>
             <w:r>
@@ -1582,13 +1649,13 @@
               <w:rPr>
                 <w:b/>
               </w:rPr>
-              <w:t>Smooth density (shifted +1)</w:t>
+              <w:t>Density (+1)</w:t>
             </w:r>
           </w:p>
         </w:tc>
         <w:tc>
           <w:tcPr>
-            <w:tcW w:type="dxa" w:w="1824"/>
+            <w:tcW w:type="dxa" w:w="1303"/>
           </w:tcPr>
           <w:p>
             <w:r>
@@ -1600,7 +1667,43 @@
               <w:rPr>
                 <w:b/>
               </w:rPr>
-              <w:t>Ratio</w:t>
+              <w:t>Ratio +1</w:t>
+            </w:r>
+          </w:p>
+        </w:tc>
+        <w:tc>
+          <w:tcPr>
+            <w:tcW w:type="dxa" w:w="1303"/>
+          </w:tcPr>
+          <w:p>
+            <w:r>
+              <w:rPr>
+                <w:b/>
+              </w:rPr>
+            </w:r>
+            <w:r>
+              <w:rPr>
+                <w:b/>
+              </w:rPr>
+              <w:t>Density (−1)</w:t>
+            </w:r>
+          </w:p>
+        </w:tc>
+        <w:tc>
+          <w:tcPr>
+            <w:tcW w:type="dxa" w:w="1303"/>
+          </w:tcPr>
+          <w:p>
+            <w:r>
+              <w:rPr>
+                <w:b/>
+              </w:rPr>
+            </w:r>
+            <w:r>
+              <w:rPr>
+                <w:b/>
+              </w:rPr>
+              <w:t>Ratio −1</w:t>
             </w:r>
           </w:p>
         </w:tc>
@@ -1608,7 +1711,7 @@
       <w:tr>
         <w:tc>
           <w:tcPr>
-            <w:tcW w:type="dxa" w:w="1824"/>
+            <w:tcW w:type="dxa" w:w="1303"/>
           </w:tcPr>
           <w:p>
             <w:r/>
@@ -1619,45 +1722,67 @@
         </w:tc>
         <w:tc>
           <w:tcPr>
-            <w:tcW w:type="dxa" w:w="1824"/>
+            <w:tcW w:type="dxa" w:w="1303"/>
           </w:tcPr>
           <w:p>
             <w:r/>
             <w:r>
-              <w:t>5664</w:t>
+              <w:t>6738</w:t>
             </w:r>
           </w:p>
         </w:tc>
         <w:tc>
           <w:tcPr>
-            <w:tcW w:type="dxa" w:w="1824"/>
+            <w:tcW w:type="dxa" w:w="1303"/>
           </w:tcPr>
           <w:p>
             <w:r/>
             <w:r>
-              <w:t>0.228</w:t>
+              <w:t>0.225</w:t>
             </w:r>
           </w:p>
         </w:tc>
         <w:tc>
           <w:tcPr>
-            <w:tcW w:type="dxa" w:w="1824"/>
+            <w:tcW w:type="dxa" w:w="1303"/>
           </w:tcPr>
           <w:p>
             <w:r/>
             <w:r>
-              <w:t>0.236</w:t>
+              <w:t>0.241</w:t>
             </w:r>
           </w:p>
         </w:tc>
         <w:tc>
           <w:tcPr>
-            <w:tcW w:type="dxa" w:w="1824"/>
+            <w:tcW w:type="dxa" w:w="1303"/>
           </w:tcPr>
           <w:p>
             <w:r/>
             <w:r>
-              <w:t>0.97×</w:t>
+              <w:t>0.93×</w:t>
+            </w:r>
+          </w:p>
+        </w:tc>
+        <w:tc>
+          <w:tcPr>
+            <w:tcW w:type="dxa" w:w="1303"/>
+          </w:tcPr>
+          <w:p>
+            <w:r/>
+            <w:r>
+              <w:t>0.200</w:t>
+            </w:r>
+          </w:p>
+        </w:tc>
+        <w:tc>
+          <w:tcPr>
+            <w:tcW w:type="dxa" w:w="1303"/>
+          </w:tcPr>
+          <w:p>
+            <w:r/>
+            <w:r>
+              <w:t>1.13×</w:t>
             </w:r>
           </w:p>
         </w:tc>
@@ -1665,7 +1790,7 @@
       <w:tr>
         <w:tc>
           <w:tcPr>
-            <w:tcW w:type="dxa" w:w="1824"/>
+            <w:tcW w:type="dxa" w:w="1303"/>
           </w:tcPr>
           <w:p>
             <w:r/>
@@ -1676,40 +1801,40 @@
         </w:tc>
         <w:tc>
           <w:tcPr>
-            <w:tcW w:type="dxa" w:w="1824"/>
+            <w:tcW w:type="dxa" w:w="1303"/>
           </w:tcPr>
           <w:p>
             <w:r/>
             <w:r>
-              <w:t>4714</w:t>
+              <w:t>5616</w:t>
             </w:r>
           </w:p>
         </w:tc>
         <w:tc>
           <w:tcPr>
-            <w:tcW w:type="dxa" w:w="1824"/>
+            <w:tcW w:type="dxa" w:w="1303"/>
           </w:tcPr>
           <w:p>
             <w:r/>
             <w:r>
-              <w:t>0.274</w:t>
+              <w:t>0.270</w:t>
             </w:r>
           </w:p>
         </w:tc>
         <w:tc>
           <w:tcPr>
-            <w:tcW w:type="dxa" w:w="1824"/>
+            <w:tcW w:type="dxa" w:w="1303"/>
           </w:tcPr>
           <w:p>
             <w:r/>
             <w:r>
-              <w:t>0.186</w:t>
+              <w:t>0.192</w:t>
             </w:r>
           </w:p>
         </w:tc>
         <w:tc>
           <w:tcPr>
-            <w:tcW w:type="dxa" w:w="1824"/>
+            <w:tcW w:type="dxa" w:w="1303"/>
           </w:tcPr>
           <w:p>
             <w:r/>
@@ -1717,7 +1842,29 @@
               <w:rPr>
                 <w:b/>
               </w:rPr>
-              <w:t>1.47×</w:t>
+              <w:t>1.41×</w:t>
+            </w:r>
+          </w:p>
+        </w:tc>
+        <w:tc>
+          <w:tcPr>
+            <w:tcW w:type="dxa" w:w="1303"/>
+          </w:tcPr>
+          <w:p>
+            <w:r/>
+            <w:r>
+              <w:t>0.240</w:t>
+            </w:r>
+          </w:p>
+        </w:tc>
+        <w:tc>
+          <w:tcPr>
+            <w:tcW w:type="dxa" w:w="1303"/>
+          </w:tcPr>
+          <w:p>
+            <w:r/>
+            <w:r>
+              <w:t>1.13×</w:t>
             </w:r>
           </w:p>
         </w:tc>
@@ -1725,7 +1872,7 @@
       <w:tr>
         <w:tc>
           <w:tcPr>
-            <w:tcW w:type="dxa" w:w="1824"/>
+            <w:tcW w:type="dxa" w:w="1303"/>
           </w:tcPr>
           <w:p>
             <w:r/>
@@ -1736,18 +1883,18 @@
         </w:tc>
         <w:tc>
           <w:tcPr>
-            <w:tcW w:type="dxa" w:w="1824"/>
+            <w:tcW w:type="dxa" w:w="1303"/>
           </w:tcPr>
           <w:p>
             <w:r/>
             <w:r>
-              <w:t>3985</w:t>
+              <w:t>4740</w:t>
             </w:r>
           </w:p>
         </w:tc>
         <w:tc>
           <w:tcPr>
-            <w:tcW w:type="dxa" w:w="1824"/>
+            <w:tcW w:type="dxa" w:w="1303"/>
           </w:tcPr>
           <w:p>
             <w:r/>
@@ -1758,7 +1905,242 @@
         </w:tc>
         <w:tc>
           <w:tcPr>
-            <w:tcW w:type="dxa" w:w="1824"/>
+            <w:tcW w:type="dxa" w:w="1303"/>
+          </w:tcPr>
+          <w:p>
+            <w:r/>
+            <w:r>
+              <w:t>0.136</w:t>
+            </w:r>
+          </w:p>
+        </w:tc>
+        <w:tc>
+          <w:tcPr>
+            <w:tcW w:type="dxa" w:w="1303"/>
+          </w:tcPr>
+          <w:p>
+            <w:r/>
+            <w:r>
+              <w:rPr>
+                <w:b/>
+              </w:rPr>
+              <w:t>1.66×</w:t>
+            </w:r>
+          </w:p>
+        </w:tc>
+        <w:tc>
+          <w:tcPr>
+            <w:tcW w:type="dxa" w:w="1303"/>
+          </w:tcPr>
+          <w:p>
+            <w:r/>
+            <w:r>
+              <w:t>0.193</w:t>
+            </w:r>
+          </w:p>
+        </w:tc>
+        <w:tc>
+          <w:tcPr>
+            <w:tcW w:type="dxa" w:w="1303"/>
+          </w:tcPr>
+          <w:p>
+            <w:r/>
+            <w:r>
+              <w:t>1.17×</w:t>
+            </w:r>
+          </w:p>
+        </w:tc>
+      </w:tr>
+      <w:tr>
+        <w:tc>
+          <w:tcPr>
+            <w:tcW w:type="dxa" w:w="1303"/>
+          </w:tcPr>
+          <w:p>
+            <w:r/>
+            <w:r>
+              <w:t>≥ 24</w:t>
+            </w:r>
+          </w:p>
+        </w:tc>
+        <w:tc>
+          <w:tcPr>
+            <w:tcW w:type="dxa" w:w="1303"/>
+          </w:tcPr>
+          <w:p>
+            <w:r/>
+            <w:r>
+              <w:t>3076</w:t>
+            </w:r>
+          </w:p>
+        </w:tc>
+        <w:tc>
+          <w:tcPr>
+            <w:tcW w:type="dxa" w:w="1303"/>
+          </w:tcPr>
+          <w:p>
+            <w:r/>
+            <w:r>
+              <w:t>0.221</w:t>
+            </w:r>
+          </w:p>
+        </w:tc>
+        <w:tc>
+          <w:tcPr>
+            <w:tcW w:type="dxa" w:w="1303"/>
+          </w:tcPr>
+          <w:p>
+            <w:r/>
+            <w:r>
+              <w:t>0.147</w:t>
+            </w:r>
+          </w:p>
+        </w:tc>
+        <w:tc>
+          <w:tcPr>
+            <w:tcW w:type="dxa" w:w="1303"/>
+          </w:tcPr>
+          <w:p>
+            <w:r/>
+            <w:r>
+              <w:rPr>
+                <w:b/>
+              </w:rPr>
+              <w:t>1.50×</w:t>
+            </w:r>
+          </w:p>
+        </w:tc>
+        <w:tc>
+          <w:tcPr>
+            <w:tcW w:type="dxa" w:w="1303"/>
+          </w:tcPr>
+          <w:p>
+            <w:r/>
+            <w:r>
+              <w:t>0.195</w:t>
+            </w:r>
+          </w:p>
+        </w:tc>
+        <w:tc>
+          <w:tcPr>
+            <w:tcW w:type="dxa" w:w="1303"/>
+          </w:tcPr>
+          <w:p>
+            <w:r/>
+            <w:r>
+              <w:t>1.13×</w:t>
+            </w:r>
+          </w:p>
+        </w:tc>
+      </w:tr>
+      <w:tr>
+        <w:tc>
+          <w:tcPr>
+            <w:tcW w:type="dxa" w:w="1303"/>
+          </w:tcPr>
+          <w:p>
+            <w:r/>
+            <w:r>
+              <w:t>≥ 32</w:t>
+            </w:r>
+          </w:p>
+        </w:tc>
+        <w:tc>
+          <w:tcPr>
+            <w:tcW w:type="dxa" w:w="1303"/>
+          </w:tcPr>
+          <w:p>
+            <w:r/>
+            <w:r>
+              <w:t>1892</w:t>
+            </w:r>
+          </w:p>
+        </w:tc>
+        <w:tc>
+          <w:tcPr>
+            <w:tcW w:type="dxa" w:w="1303"/>
+          </w:tcPr>
+          <w:p>
+            <w:r/>
+            <w:r>
+              <w:t>0.175</w:t>
+            </w:r>
+          </w:p>
+        </w:tc>
+        <w:tc>
+          <w:tcPr>
+            <w:tcW w:type="dxa" w:w="1303"/>
+          </w:tcPr>
+          <w:p>
+            <w:r/>
+            <w:r>
+              <w:t>0.090</w:t>
+            </w:r>
+          </w:p>
+        </w:tc>
+        <w:tc>
+          <w:tcPr>
+            <w:tcW w:type="dxa" w:w="1303"/>
+          </w:tcPr>
+          <w:p>
+            <w:r/>
+            <w:r>
+              <w:rPr>
+                <w:b/>
+              </w:rPr>
+              <w:t>1.95×</w:t>
+            </w:r>
+          </w:p>
+        </w:tc>
+        <w:tc>
+          <w:tcPr>
+            <w:tcW w:type="dxa" w:w="1303"/>
+          </w:tcPr>
+          <w:p>
+            <w:r/>
+            <w:r>
+              <w:t>0.144</w:t>
+            </w:r>
+          </w:p>
+        </w:tc>
+        <w:tc>
+          <w:tcPr>
+            <w:tcW w:type="dxa" w:w="1303"/>
+          </w:tcPr>
+          <w:p>
+            <w:r/>
+            <w:r>
+              <w:t>1.21×</w:t>
+            </w:r>
+          </w:p>
+        </w:tc>
+      </w:tr>
+      <w:tr>
+        <w:tc>
+          <w:tcPr>
+            <w:tcW w:type="dxa" w:w="1303"/>
+          </w:tcPr>
+          <w:p>
+            <w:r/>
+            <w:r>
+              <w:t>≥ 36</w:t>
+            </w:r>
+          </w:p>
+        </w:tc>
+        <w:tc>
+          <w:tcPr>
+            <w:tcW w:type="dxa" w:w="1303"/>
+          </w:tcPr>
+          <w:p>
+            <w:r/>
+            <w:r>
+              <w:t>1500</w:t>
+            </w:r>
+          </w:p>
+        </w:tc>
+        <w:tc>
+          <w:tcPr>
+            <w:tcW w:type="dxa" w:w="1303"/>
           </w:tcPr>
           <w:p>
             <w:r/>
@@ -1769,7 +2151,18 @@
         </w:tc>
         <w:tc>
           <w:tcPr>
-            <w:tcW w:type="dxa" w:w="1824"/>
+            <w:tcW w:type="dxa" w:w="1303"/>
+          </w:tcPr>
+          <w:p>
+            <w:r/>
+            <w:r>
+              <w:t>0.064</w:t>
+            </w:r>
+          </w:p>
+        </w:tc>
+        <w:tc>
+          <w:tcPr>
+            <w:tcW w:type="dxa" w:w="1303"/>
           </w:tcPr>
           <w:p>
             <w:r/>
@@ -1777,7 +2170,29 @@
               <w:rPr>
                 <w:b/>
               </w:rPr>
-              <w:t>1.69×</w:t>
+              <w:t>2.09×</w:t>
+            </w:r>
+          </w:p>
+        </w:tc>
+        <w:tc>
+          <w:tcPr>
+            <w:tcW w:type="dxa" w:w="1303"/>
+          </w:tcPr>
+          <w:p>
+            <w:r/>
+            <w:r>
+              <w:t>0.121</w:t>
+            </w:r>
+          </w:p>
+        </w:tc>
+        <w:tc>
+          <w:tcPr>
+            <w:tcW w:type="dxa" w:w="1303"/>
+          </w:tcPr>
+          <w:p>
+            <w:r/>
+            <w:r>
+              <w:t>1.10×</w:t>
             </w:r>
           </w:p>
         </w:tc>
@@ -1785,127 +2200,7 @@
       <w:tr>
         <w:tc>
           <w:tcPr>
-            <w:tcW w:type="dxa" w:w="1824"/>
-          </w:tcPr>
-          <w:p>
-            <w:r/>
-            <w:r>
-              <w:t>≥ 24</w:t>
-            </w:r>
-          </w:p>
-        </w:tc>
-        <w:tc>
-          <w:tcPr>
-            <w:tcW w:type="dxa" w:w="1824"/>
-          </w:tcPr>
-          <w:p>
-            <w:r/>
-            <w:r>
-              <w:t>2643</w:t>
-            </w:r>
-          </w:p>
-        </w:tc>
-        <w:tc>
-          <w:tcPr>
-            <w:tcW w:type="dxa" w:w="1824"/>
-          </w:tcPr>
-          <w:p>
-            <w:r/>
-            <w:r>
-              <w:t>0.220</w:t>
-            </w:r>
-          </w:p>
-        </w:tc>
-        <w:tc>
-          <w:tcPr>
-            <w:tcW w:type="dxa" w:w="1824"/>
-          </w:tcPr>
-          <w:p>
-            <w:r/>
-            <w:r>
-              <w:t>0.142</w:t>
-            </w:r>
-          </w:p>
-        </w:tc>
-        <w:tc>
-          <w:tcPr>
-            <w:tcW w:type="dxa" w:w="1824"/>
-          </w:tcPr>
-          <w:p>
-            <w:r/>
-            <w:r>
-              <w:rPr>
-                <w:b/>
-              </w:rPr>
-              <w:t>1.56×</w:t>
-            </w:r>
-          </w:p>
-        </w:tc>
-      </w:tr>
-      <w:tr>
-        <w:tc>
-          <w:tcPr>
-            <w:tcW w:type="dxa" w:w="1824"/>
-          </w:tcPr>
-          <w:p>
-            <w:r/>
-            <w:r>
-              <w:t>≥ 32</w:t>
-            </w:r>
-          </w:p>
-        </w:tc>
-        <w:tc>
-          <w:tcPr>
-            <w:tcW w:type="dxa" w:w="1824"/>
-          </w:tcPr>
-          <w:p>
-            <w:r/>
-            <w:r>
-              <w:t>1636</w:t>
-            </w:r>
-          </w:p>
-        </w:tc>
-        <w:tc>
-          <w:tcPr>
-            <w:tcW w:type="dxa" w:w="1824"/>
-          </w:tcPr>
-          <w:p>
-            <w:r/>
-            <w:r>
-              <w:t>0.169</w:t>
-            </w:r>
-          </w:p>
-        </w:tc>
-        <w:tc>
-          <w:tcPr>
-            <w:tcW w:type="dxa" w:w="1824"/>
-          </w:tcPr>
-          <w:p>
-            <w:r/>
-            <w:r>
-              <w:t>0.087</w:t>
-            </w:r>
-          </w:p>
-        </w:tc>
-        <w:tc>
-          <w:tcPr>
-            <w:tcW w:type="dxa" w:w="1824"/>
-          </w:tcPr>
-          <w:p>
-            <w:r/>
-            <w:r>
-              <w:rPr>
-                <w:b/>
-              </w:rPr>
-              <w:t>1.93×</w:t>
-            </w:r>
-          </w:p>
-        </w:tc>
-      </w:tr>
-      <w:tr>
-        <w:tc>
-          <w:tcPr>
-            <w:tcW w:type="dxa" w:w="1824"/>
+            <w:tcW w:type="dxa" w:w="1303"/>
           </w:tcPr>
           <w:p>
             <w:r/>
@@ -1916,40 +2211,40 @@
         </w:tc>
         <w:tc>
           <w:tcPr>
-            <w:tcW w:type="dxa" w:w="1824"/>
+            <w:tcW w:type="dxa" w:w="1303"/>
           </w:tcPr>
           <w:p>
             <w:r/>
             <w:r>
-              <w:t>772</w:t>
+              <w:t>867</w:t>
             </w:r>
           </w:p>
         </w:tc>
         <w:tc>
           <w:tcPr>
-            <w:tcW w:type="dxa" w:w="1824"/>
+            <w:tcW w:type="dxa" w:w="1303"/>
           </w:tcPr>
           <w:p>
             <w:r/>
             <w:r>
-              <w:t>0.139</w:t>
+              <w:t>0.145</w:t>
             </w:r>
           </w:p>
         </w:tc>
         <w:tc>
           <w:tcPr>
-            <w:tcW w:type="dxa" w:w="1824"/>
+            <w:tcW w:type="dxa" w:w="1303"/>
           </w:tcPr>
           <w:p>
             <w:r/>
             <w:r>
-              <w:t>0.061</w:t>
+              <w:t>0.070</w:t>
             </w:r>
           </w:p>
         </w:tc>
         <w:tc>
           <w:tcPr>
-            <w:tcW w:type="dxa" w:w="1824"/>
+            <w:tcW w:type="dxa" w:w="1303"/>
           </w:tcPr>
           <w:p>
             <w:r/>
@@ -1957,7 +2252,29 @@
               <w:rPr>
                 <w:b/>
               </w:rPr>
-              <w:t>2.28×</w:t>
+              <w:t>2.07×</w:t>
+            </w:r>
+          </w:p>
+        </w:tc>
+        <w:tc>
+          <w:tcPr>
+            <w:tcW w:type="dxa" w:w="1303"/>
+          </w:tcPr>
+          <w:p>
+            <w:r/>
+            <w:r>
+              <w:t>0.130</w:t>
+            </w:r>
+          </w:p>
+        </w:tc>
+        <w:tc>
+          <w:tcPr>
+            <w:tcW w:type="dxa" w:w="1303"/>
+          </w:tcPr>
+          <w:p>
+            <w:r/>
+            <w:r>
+              <w:t>1.12×</w:t>
             </w:r>
           </w:p>
         </w:tc>
@@ -1967,7 +2284,36 @@
     <w:p>
       <w:pPr/>
       <w:r>
-        <w:t>The anomaly at threshold 14 (ratio &lt; 1) reflects the high raw frequency of count 15 and the smooth count 9 falling below the 14 threshold. Above 16, the shift ratio rises monotonically and is largest at high thresholds, where the signal-to-noise ratio is best.</w:t>
+        <w:rPr>
+          <w:color w:val="008C00"/>
+        </w:rPr>
+        <w:t xml:space="preserve">The anomaly at threshold 14 (ratio &lt; 1) reflects the high raw frequency of count 15 and the smooth count 9 falling below the 14 threshold. Above 16, the shift ratio rises monotonically and is largest at high thresholds, where the signal-to-noise ratio is best. Notably, the effect is consistently stronger against the +1 shift than against the −1 shift across all thresholds ≥ 16 (1.41× vs. 1.13× at ≥16; 2.09× vs. 1.10× at ≥36), indicating that the count </w:t>
+      </w:r>
+      <w:r>
+        <w:rPr>
+          <w:i/>
+          <w:color w:val="008C00"/>
+        </w:rPr>
+        <w:t>above</w:t>
+      </w:r>
+      <w:r>
+        <w:rPr>
+          <w:color w:val="008C00"/>
+        </w:rPr>
+        <w:t xml:space="preserve"> a smooth number is more reliably depleted than the count </w:t>
+      </w:r>
+      <w:r>
+        <w:rPr>
+          <w:i/>
+          <w:color w:val="008C00"/>
+        </w:rPr>
+        <w:t>below</w:t>
+      </w:r>
+      <w:r>
+        <w:rPr>
+          <w:color w:val="008C00"/>
+        </w:rPr>
+        <w:t xml:space="preserve"> — an asymmetry discussed in §6.2.</w:t>
       </w:r>
     </w:p>
     <w:p>
@@ -2382,16 +2728,10 @@
     <w:p>
       <w:pPr/>
       <w:r>
-        <w:t xml:space="preserve">A more speculative variant of this hypothesis invokes the dynamics of neural networks directly: smooth-number repetition counts may arise as </w:t>
-      </w:r>
-      <w:r>
         <w:rPr>
-          <w:i/>
+          <w:color w:val="008C00"/>
         </w:rPr>
-        <w:t>resonant</w:t>
-      </w:r>
-      <w:r>
-        <w:t xml:space="preserve"> outcomes of the brain's rhythmic architecture, in the same way that certain oscillation frequencies are privileged by the connectivity of neural circuits. We mention this possibility without endorsing it; both hypotheses, and their relationship to the empirical data, remain open questions for future work.</w:t>
+        <w:t>A more concrete formulation of this hypothesis [REF-BOOK] proposes that the brain maintains implicit binary-ternary "counters" for musical events during both listening and composition. If incoming events are stored by grouping signals into pairs and triples — the same chunking principle that governs note durations and metric hierarchy — then the counter's accumulated total at any stage is of the form 2^a·3^b. The sense of "complete" or "enough" would correspond to the counter reaching its most stable state, where all pairs and triplets are evenly filled. This account does not require the composer to consciously plan a smooth total; it only requires that the intuitive sense of closure is calibrated by a binary-ternary memory architecture operating below the threshold of awareness. The relationship between this conjecture and the empirical data remains an open question for future investigation.</w:t>
       </w:r>
     </w:p>
     <w:p>
@@ -2446,7 +2786,39 @@
         <w:t>Inversion merging.</w:t>
       </w:r>
       <w:r>
-        <w:t xml:space="preserve"> The union count (direct + inverted − coinciding) differs from the direct count by a variable amount that depends on how often the inverted form actually appears in the piece; in practice the ratio of inverted to direct occurrences varies widely across motifs and pieces. Merging therefore does not systematically double counts, and the doubling artefact (2N smooth whenever N smooth) does not apply. For transparency we report the enrichment both with and without inversion merging: [TODO: add no-inv figure] vs. 2.25×.</w:t>
+        <w:t xml:space="preserve"> The union count (direct + inverted − coinciding) differs from the direct count by a variable amount that depends on how often the inverted form actually appears in the piece; in practice the ratio of inverted to direct occurrences varies widely across motifs and pieces. Merging therefore does not systematically double counts, and the doubling artefact (2N smooth whenever N smooth) does not apply. For transparency we report the enrichment both with and without inversion merging: </w:t>
+      </w:r>
+      <w:r>
+        <w:rPr>
+          <w:color w:val="008C00"/>
+        </w:rPr>
+        <w:t xml:space="preserve">direct-only </w:t>
+      </w:r>
+      <w:r>
+        <w:rPr>
+          <w:b/>
+          <w:color w:val="008C00"/>
+        </w:rPr>
+        <w:t>2.22×</w:t>
+      </w:r>
+      <w:r>
+        <w:rPr>
+          <w:color w:val="008C00"/>
+        </w:rPr>
+        <w:t xml:space="preserve"> vs. merged </w:t>
+      </w:r>
+      <w:r>
+        <w:rPr>
+          <w:b/>
+          <w:color w:val="008C00"/>
+        </w:rPr>
+        <w:t>2.25×</w:t>
+      </w:r>
+      <w:r>
+        <w:rPr>
+          <w:color w:val="008C00"/>
+        </w:rPr>
+        <w:t>. The difference is negligible (&lt; 2%), confirming that inversion merging does not artificially inflate the result.</w:t>
       </w:r>
     </w:p>
     <w:p>
@@ -2484,7 +2856,7 @@
     <w:p>
       <w:pPr/>
       <w:r>
-        <w:t>We have shown that motif occurrence counts in a large corpus of Bach and Baroque music are smooth numbers (of the form 2^a · 3^b) approximately 2.25× more often than expected under a log-uniform null model, with the excess confirmed by a shift test that is robust to threshold choice and reaches 2.28× at high count values. The pattern is consistent across Baroque composers (Corelli, Scarlatti, Buxtehude, Frescobaldi) and persists into the Classical period (Haydn, Mozart, Beethoven).</w:t>
+        <w:t>We have shown that motif occurrence counts in a large corpus of 1,193 Bach and Baroque pieces are smooth numbers (of the form 2^a · 3^b) approximately 2.25× more often than expected under a log-uniform null model, with the excess confirmed by a shift test that is robust to threshold choice and reaches 2.09× at threshold ≥ 36. The pattern is consistent across Baroque composers (Corelli, Scarlatti, Buxtehude, Frescobaldi) and persists into the Classical period (Haydn, Mozart, Beethoven).</w:t>
       </w:r>
     </w:p>
     <w:p>
@@ -2508,6 +2880,100 @@
           <w:i/>
         </w:rPr>
         <w:t>[To be completed. Key works to cite: Pressing 1983 on rhythmic complexity; London 2004 Hearing in Time; Cohn on hexatonic and metric theory; Conklin &amp; Witten 1995 on multiple viewpoints; Lartillot MIR works; Collins et al. 2011 MIREX motif; relevant music theory corpus studies.]</w:t>
+      </w:r>
+    </w:p>
+    <w:p>
+      <w:pPr/>
+      <w:r>
+        <w:rPr>
+          <w:b/>
+          <w:color w:val="008C00"/>
+        </w:rPr>
+        <w:t>[REF-BOOK]</w:t>
+      </w:r>
+      <w:r>
+        <w:rPr>
+          <w:color w:val="008C00"/>
+        </w:rPr>
+        <w:t xml:space="preserve"> Vynograd, [first name]. </w:t>
+      </w:r>
+      <w:r>
+        <w:rPr>
+          <w:i/>
+          <w:color w:val="008C00"/>
+        </w:rPr>
+        <w:t>[title TBD]</w:t>
+      </w:r>
+      <w:r>
+        <w:rPr>
+          <w:color w:val="008C00"/>
+        </w:rPr>
+        <w:t xml:space="preserve"> [unpublished monograph / publisher TBD, year TBD]. </w:t>
+      </w:r>
+      <w:r>
+        <w:rPr>
+          <w:i/>
+          <w:color w:val="008C00"/>
+        </w:rPr>
+        <w:t>(The present article is a corpus-scale validation of the main hypothesis of this work.)</w:t>
+      </w:r>
+    </w:p>
+    <w:p>
+      <w:pPr/>
+      <w:r>
+        <w:rPr>
+          <w:b/>
+          <w:color w:val="008C00"/>
+        </w:rPr>
+        <w:t>[REF-ART1]</w:t>
+      </w:r>
+      <w:r>
+        <w:rPr>
+          <w:color w:val="008C00"/>
+        </w:rPr>
+        <w:t xml:space="preserve"> Vynograd, [first name] and Seryachkov, Vladimir. "Насколько крупным может быть музыкальный метр?" [How large can musical metre be?]. In: </w:t>
+      </w:r>
+      <w:r>
+        <w:rPr>
+          <w:i/>
+          <w:color w:val="008C00"/>
+        </w:rPr>
+        <w:t>Protsessy muzykal'nogo tvorchestva</w:t>
+      </w:r>
+      <w:r>
+        <w:rPr>
+          <w:color w:val="008C00"/>
+        </w:rPr>
+        <w:t>, vol. 11. Moscow, 2010. ISSN 2073-9095.</w:t>
+      </w:r>
+    </w:p>
+    <w:p>
+      <w:pPr/>
+      <w:r>
+        <w:rPr>
+          <w:b/>
+          <w:color w:val="008C00"/>
+        </w:rPr>
+        <w:t>[REF-ART2]</w:t>
+      </w:r>
+      <w:r>
+        <w:rPr>
+          <w:color w:val="008C00"/>
+        </w:rPr>
+        <w:t xml:space="preserve"> Vynograd, [first name]. "Гиперметрическая регулярность в ритме смены гармонических функций на примерах из произведений И.С. Баха" [Hypermetric regularity in the rhythm of harmonic-function changes, illustrated from J.S. Bach]. </w:t>
+      </w:r>
+      <w:r>
+        <w:rPr>
+          <w:i/>
+          <w:color w:val="008C00"/>
+        </w:rPr>
+        <w:t>Sovremennye problemy nauki i obrazovaniya</w:t>
+      </w:r>
+      <w:r>
+        <w:rPr>
+          <w:color w:val="008C00"/>
+        </w:rPr>
+        <w:t>. ISSN 1817-6321. http://online.rae.ru/470</w:t>
       </w:r>
     </w:p>
     <w:p>

</xml_diff>